<commit_message>
revisão do texto do documento
</commit_message>
<xml_diff>
--- a/docs/TCC-EBAC-QE.docx
+++ b/docs/TCC-EBAC-QE.docx
@@ -468,7 +468,7 @@
           <w:sz w:val="24"/>
           <w:szCs w:val="24"/>
         </w:rPr>
-        <w:t>Este trabalho apresenta o planejamento e a execução da estratégia de qualidade para o e-commerce EBAC Shop, seguindo o fluxo de trabalho de um Quality Engineer em um time ágil. A partir das histórias de usuário de carrinho, login e API de cupons, e de cinco novas histórias (Catálogo de Produtos, Painel Minha Conta, Meus Pedidos, Endereços e Detalhes da Conta), foram definidos uma estratégia de testes em mapa mental, critérios de aceitação em Gherkin e casos de teste com técnicas de partição de equivalência, valor limite e tabela de decisão. Os casos priorizados foram automatizados em quatro frentes: interface web com Cypress e Page Objects, API com Supertest e validação de contratos com Joi, aplicativo mobile com WebdriverIO e Appium no Sauce Labs e performance com k6 (20 usuários virtuais, 2 minutos e ramp-up de 20 segundos). Todos os testes geram relatórios e rodam em integração contínua no GitHub Actions, com publicação no GitHub Pages. A execução revelou defeitos em regras de negócio não implementadas (limite de itens, valor máximo e cupom automático no carrinho e bloqueio de login após três tentativas) e degradação de desempenho sob carga, evidenciando o valor da combinação entre testes manuais, automação e análise de resultados.</w:t>
+        <w:t>Neste trabalho eu montei a estratégia de testes da loja virtual EBAC Shop, como se estivesse trabalhando como QE em um time ágil. Usei as histórias de usuário de carrinho, login e API de cupons e criei mais cinco histórias (Catálogo de Produtos, Painel Minha Conta, Meus Pedidos, Endereços e Detalhes da Conta). Para cada uma escrevi critérios de aceitação em Gherkin e casos de teste usando partição de equivalência, valor limite e tabela de decisão. Depois automatizei os principais casos: testes web com Cypress, testes da API com Supertest (validando os contratos com Joi), testes do aplicativo com WebdriverIO e Appium no Sauce Labs e testes de carga com k6, com 20 usuários durante 2 minutos. Os testes geram relatórios e rodam no GitHub Actions. Durante a execução encontrei bugs em regras de negócio do carrinho e do login e também vi que a loja fica lenta quando recebe vários acessos ao mesmo tempo.</w:t>
       </w:r>
     </w:p>
     <w:p>
@@ -773,7 +773,7 @@
         <w:tab/>
         <w:t>Integração contínua</w:t>
         <w:tab/>
-        <w:t>22</w:t>
+        <w:t>21</w:t>
       </w:r>
     </w:p>
     <w:p>
@@ -798,7 +798,7 @@
         <w:tab/>
         <w:t>Testes de performance</w:t>
         <w:tab/>
-        <w:t>23</w:t>
+        <w:t>22</w:t>
       </w:r>
     </w:p>
     <w:p>
@@ -823,7 +823,7 @@
         <w:tab/>
         <w:t>CONCLUSÃO</w:t>
         <w:tab/>
-        <w:t>27</w:t>
+        <w:t>25</w:t>
       </w:r>
     </w:p>
     <w:p>
@@ -848,7 +848,7 @@
         <w:tab/>
         <w:t>REFERÊNCIAS BIBLIOGRÁFICAS</w:t>
         <w:tab/>
-        <w:t>28</w:t>
+        <w:t>26</w:t>
       </w:r>
     </w:p>
     <w:p>
@@ -892,7 +892,7 @@
         <w:jc w:val="both"/>
       </w:pPr>
       <w:r>
-        <w:t>A qualidade de software deixou de ser uma etapa isolada no fim do desenvolvimento e passou a acompanhar todo o ciclo de vida do produto. Em times ágeis, o Engenheiro de Qualidade (Quality Engineer – QE) participa desde o refinamento das histórias, ajudando a esclarecer regras de negócio e critérios de aceitação, até a entrega, garantindo que as funcionalidades sejam validadas de forma rápida, repetível e rastreável.</w:t>
+        <w:t>Hoje o teste de software não fica só para o final do projeto. Em um time ágil o QE participa desde a conversa sobre as histórias, ajudando a deixar as regras claras, até a entrega, garantindo que tudo foi testado.</w:t>
       </w:r>
     </w:p>
     <w:p>
@@ -902,7 +902,7 @@
         <w:jc w:val="both"/>
       </w:pPr>
       <w:r>
-        <w:t>O cenário deste trabalho é a EBAC Shop, uma loja virtual construída em WordPress/WooCommerce, disponível em ambiente web, com uma API REST para administração de cupons e um aplicativo mobile de catálogo. O objetivo é aplicar os conhecimentos da formação para definir e executar uma estratégia de testes adequada a esse contexto, considerando as histórias de usuário já refinadas pelo time: adicionar item ao carrinho (US-0001), login na plataforma (US-0002) e API de cupons (US-0003), além de novas histórias criadas para as funcionalidades de catálogo e da área do cliente.</w:t>
+        <w:t>O cenário deste trabalho é a EBAC Shop, uma loja feita em WordPress com WooCommerce. Ela tem o site, uma API para cadastrar cupons e um aplicativo de catálogo. O objetivo foi usar o que aprendi no curso para planejar e executar os testes dessa loja, começando pelas histórias que já vieram prontas: adicionar item ao carrinho (US-0001), login na plataforma (US-0002) e API de cupons (US-0003). Também criei histórias novas para o catálogo e para a área do cliente.</w:t>
       </w:r>
     </w:p>
     <w:p>
@@ -912,7 +912,7 @@
         <w:jc w:val="both"/>
       </w:pPr>
       <w:r>
-        <w:t>Ao longo do documento são apresentados a estratégia de testes em formato de mapa mental, os critérios de aceitação escritos em Gherkin, os casos de teste derivados com técnicas de teste, o repositório com o código-fonte, as automações de UI, API e mobile com seus relatórios, a integração contínua com GitHub Actions e os testes de performance com k6, com a análise dos resultados obtidos. Espera-se, com isso, demonstrar o fluxo completo de trabalho de um QE – do planejamento à entrega – e registrar os defeitos e riscos identificados no produto.</w:t>
+        <w:t>Nas próximas seções apresento a estratégia de testes em um mapa mental, os critérios de aceitação em Gherkin, os casos de teste, o repositório no GitHub, as automações de UI, API e mobile, a integração contínua e os testes de performance. No final falo sobre os resultados e os problemas que encontrei.</w:t>
       </w:r>
     </w:p>
     <w:p>
@@ -935,7 +935,7 @@
         <w:jc w:val="both"/>
       </w:pPr>
       <w:r>
-        <w:t>Para este trabalho de conclusão de curso foi elaborada uma estratégia de testes para validar o e-commerce EBAC Shop (http://lojaebac.ebaconline.art.br), considerando as histórias de usuário como se o autor fizesse parte de um time ágil. Como base, foi utilizado o Trabalho de Consolidação do Módulo 19 (estratégia de testes com automação priorizada nas camadas de API e com E2E enxuto para fluxos críticos), além das atividades práticas desenvolvidas nos módulos anteriores (Cypress, Supertest, WebdriverIO/Appium, k6 e GitHub Actions).</w:t>
+        <w:t>O objetivo deste trabalho foi criar e executar uma estratégia de testes para a EBAC Shop (http://lojaebac.ebaconline.art.br), seguindo as histórias de usuário como se eu fizesse parte do time. Usei como base o meu trabalho do Módulo 19, onde eu já tinha defendido automatizar mais na camada de API e deixar os testes de ponta a ponta só para os fluxos mais importantes. Também reaproveitei o que fiz nos exercícios dos módulos anteriores com Cypress, Supertest, Appium, k6 e GitHub Actions.</w:t>
       </w:r>
     </w:p>
     <w:p>
@@ -945,7 +945,7 @@
         <w:jc w:val="both"/>
       </w:pPr>
       <w:r>
-        <w:t>Os ambientes considerados na estratégia foram:</w:t>
+        <w:t>Os ambientes que usei foram:</w:t>
       </w:r>
     </w:p>
     <w:p>
@@ -962,10 +962,10 @@
         <w:rPr>
           <w:b/>
         </w:rPr>
-        <w:t xml:space="preserve">Ambiente online (principal): </w:t>
-      </w:r>
-      <w:r>
-        <w:t>http://lojaebac.ebaconline.art.br – utilizado na execução local e no CI.</w:t>
+        <w:t xml:space="preserve">Site online: </w:t>
+      </w:r>
+      <w:r>
+        <w:t>http://lojaebac.ebaconline.art.br, usado nos testes locais e no GitHub Actions.</w:t>
       </w:r>
     </w:p>
     <w:p>
@@ -982,10 +982,10 @@
         <w:rPr>
           <w:b/>
         </w:rPr>
-        <w:t xml:space="preserve">Ambiente local (alternativo): </w:t>
-      </w:r>
-      <w:r>
-        <w:t>imagens Docker ernestosbarbosa/lojaebacdb e ernestosbarbosa/lojaebac, publicadas em http://localhost:80; todos os projetos aceitam a variável BASE_URL para apontar para esse ambiente.</w:t>
+        <w:t xml:space="preserve">Loja local no Docker: </w:t>
+      </w:r>
+      <w:r>
+        <w:t>imagens ernestosbarbosa/lojaebacdb e ernestosbarbosa/lojaebac em http://localhost:80. Todos os projetos aceitam a variável BASE_URL para trocar de ambiente.</w:t>
       </w:r>
     </w:p>
     <w:p>
@@ -1002,10 +1002,10 @@
         <w:rPr>
           <w:b/>
         </w:rPr>
-        <w:t xml:space="preserve">Nuvem mobile: </w:t>
-      </w:r>
-      <w:r>
-        <w:t>Sauce Labs (simuladores iOS), dispensando emuladores locais e permitindo a execução no CI.</w:t>
+        <w:t xml:space="preserve">Sauce Labs: </w:t>
+      </w:r>
+      <w:r>
+        <w:t>para rodar o aplicativo em um simulador de iPhone na nuvem, já que não tenho Mac.</w:t>
       </w:r>
     </w:p>
     <w:p>
@@ -1023,7 +1023,7 @@
         <w:jc w:val="both"/>
       </w:pPr>
       <w:r>
-        <w:t>A estratégia foi construída a partir das diretrizes do Módulo 5 e do Trabalho de Consolidação (Módulo 19). Seguindo a pirâmide de testes, a maior parte das validações automatizadas fica na camada de API (mais rápida e estável), enquanto a interface web e o aplicativo recebem testes E2E apenas para os fluxos críticos. Regras de negócio que exigem observação humana, ou que ainda não estão implementadas, são cobertas por testes manuais e exploratórios. A Tabela 1 resume a estratégia e a Figura 1 apresenta o mapa mental.</w:t>
+        <w:t>Montei a estratégia com base no que vimos no Módulo 5 e no meu trabalho do Módulo 19. Segui a ideia da pirâmide de testes: a maior parte da automação fica na API, que é mais rápida e estável, e na tela (web e app) automatizo só os fluxos principais. As regras que precisam de olhar humano, ou que a loja ainda não tem, ficam para testes manuais e exploratórios. A Tabela 1 resume a estratégia e a Figura 1 mostra o mapa mental.</w:t>
       </w:r>
     </w:p>
     <w:p>
@@ -1613,7 +1613,7 @@
         <w:jc w:val="both"/>
       </w:pPr>
       <w:r>
-        <w:t>Para cada história foram definidos critérios de aceitação em Gherkin (em português), incluindo esquemas de cenário com exemplos que já aplicam valores limite. Além das histórias US-0001 a US-0003, foram criadas as histórias US-0004 a US-0008 para as funcionalidades de Catálogo de Produtos, Painel Minha Conta, Meus Pedidos, Endereços e Detalhes da Conta. Os arquivos .feature também estão disponíveis em docs/features no repositório.</w:t>
+        <w:t>Escrevi os critérios de aceitação em Gherkin, em português. Em alguns usei Esquema do Cenário com exemplos para já testar os valores limite. Além das histórias US-0001 a US-0003, criei as histórias US-0004 a US-0008 para Catálogo de Produtos, Painel Minha Conta, Meus Pedidos, Endereços e Detalhes da Conta. Os arquivos .feature também estão na pasta docs/features do repositório.</w:t>
       </w:r>
     </w:p>
     <w:p>
@@ -6776,7 +6776,7 @@
         <w:jc w:val="both"/>
       </w:pPr>
       <w:r>
-        <w:t>Os casos de teste foram derivados dos critérios de aceitação aplicando as técnicas de partição de equivalência (PE), análise de valor limite (VL) e tabela de decisão (TD), contemplando o fluxo principal (caminho feliz), fluxos alternativos e negativos. A coluna "Autom." indica os casos automatizados (S) e os executados manualmente (N). Os IDs são os mesmos usados nos testes automatizados, garantindo rastreabilidade.</w:t>
+        <w:t>Os casos de teste saíram dos critérios de aceitação. Usei partição de equivalência (PE), valor limite (VL) e tabela de decisão (TD) e separei os casos em caminho feliz, alternativo e negativo. Na coluna "Autom." marquei com S os casos que automatizei e com N os que ficaram manuais. Os IDs são os mesmos que usei no código dos testes.</w:t>
       </w:r>
     </w:p>
     <w:p>
@@ -6786,7 +6786,7 @@
         <w:jc w:val="both"/>
       </w:pPr>
       <w:r>
-        <w:t>Pré-condição comum às histórias da área do cliente: usuário cadastrado e autenticado (aluno_ebac@teste.com).</w:t>
+        <w:t>Para as histórias da área do cliente, a pré-condição é ter um usuário cadastrado e logado (aluno_ebac@teste.com).</w:t>
       </w:r>
     </w:p>
     <w:p>
@@ -12900,7 +12900,7 @@
         <w:jc w:val="both"/>
       </w:pPr>
       <w:r>
-        <w:t>Durante a execução manual (com apoio de requisições HTTP) das regras de negócio das histórias US-0001 e US-0002, foram identificados os defeitos abaixo. Eles foram mantidos como casos manuais (não automatizados) para não quebrar o pipeline de regressão e devem ser priorizados com o PO.</w:t>
+        <w:t>Quando testei manualmente as regras de negócio das histórias US-0001 e US-0002, encontrei os bugs abaixo. Deixei esses casos como manuais para não quebrar a regressão automatizada, e eles precisam ser vistos com o PO.</w:t>
       </w:r>
     </w:p>
     <w:p>
@@ -13406,7 +13406,7 @@
         <w:jc w:val="both"/>
       </w:pPr>
       <w:r>
-        <w:t>Todo o código-fonte das automações, os arquivos Gherkin, o mapa mental, as evidências e este documento estão versionados no repositório público abaixo. O README descreve a estrutura, os pré-requisitos e os comandos de execução de cada projeto.</w:t>
+        <w:t>Todo o código das automações, os arquivos Gherkin, o mapa mental, os prints e este documento estão no repositório público abaixo. No README explico como rodar cada projeto.</w:t>
       </w:r>
     </w:p>
     <w:p>
@@ -13562,7 +13562,7 @@
         <w:jc w:val="both"/>
       </w:pPr>
       <w:r>
-        <w:t>Foram automatizados os casos marcados com "S" nas tabelas de casos de teste, cobrindo caminhos felizes, alternativos e negativos. Todos os projetos foram escritos em JavaScript/Node.js, aproveitando um único ecossistema (npm) para UI, API e mobile, e geram relatórios HTML a cada execução.</w:t>
+        <w:t>Automatizei os casos marcados com S nas tabelas, cobrindo caminho feliz, alternativo e negativo. Fiz tudo em JavaScript com Node.js, assim usei a mesma linguagem para UI, API e mobile. Todos os projetos geram relatório em HTML.</w:t>
       </w:r>
     </w:p>
     <w:p>
@@ -13580,7 +13580,7 @@
         <w:jc w:val="both"/>
       </w:pPr>
       <w:r>
-        <w:t>A automação web (pasta UI) cobre as histórias US-0001 (carrinho) e US-0002 (login) com 9 casos de teste. Foram aplicados os padrões Page Objects (login.page.js, produto.page.js, carrinho.page.js), App Actions (carrinho.actions.js, que encapsula o fluxo de adicionar produto) e Custom Commands (cy.login com cy.session), além de massa de dados em fixtures. O relatório é gerado com o cypress-mochawesome-reporter, incluindo screenshots embutidos em caso de falha.</w:t>
+        <w:t>Os testes web (pasta UI) cobrem o carrinho (US-0001) e o login (US-0002), com 9 casos no total. Usei Page Objects (login.page.js, produto.page.js e carrinho.page.js), App Actions (carrinho.actions.js, com o fluxo de adicionar produto) e um comando customizado de login com cy.session. Os dados de teste ficam nas fixtures. O relatório é gerado com o cypress-mochawesome-reporter e traz print quando algum teste falha.</w:t>
       </w:r>
     </w:p>
     <w:p>
@@ -13590,7 +13590,7 @@
         <w:jc w:val="both"/>
       </w:pPr>
       <w:r>
-        <w:t>Para justificar a escolha da ferramenta, foi feito o comparativo a seguir entre três opções de mercado.</w:t>
+        <w:t>Para escolher a ferramenta comparei três opções:</w:t>
       </w:r>
     </w:p>
     <w:p>
@@ -14458,7 +14458,7 @@
         <w:jc w:val="both"/>
       </w:pPr>
       <w:r>
-        <w:t>O Cypress foi escolhido por reunir o melhor equilíbrio para o contexto: os fluxos testados ficam em um único domínio (onde sua limitação de múltiplas abas não pesa), as esperas automáticas reduzem testes instáveis em uma loja com bastante JavaScript de terceiros, o runner facilita a depuração e o time (no caso, o autor) já possui experiência com a ferramenta, reduzindo o tempo de entrega. O Playwright seria a alternativa mais forte caso houvesse necessidade de WebKit ou múltiplas abas, e o Selenium faria sentido em times Java com Grid já existente.</w:t>
+        <w:t>Escolhi o Cypress porque os testes acontecem em um único site (então a limitação dele com várias abas não atrapalha), ele espera os elementos sozinho, o que ajuda em uma loja com muito JavaScript, e é a ferramenta que eu mais usei no curso. O Playwright seria uma boa opção se eu precisasse testar no Safari ou com várias abas, e o Selenium faz mais sentido em times que já trabalham com Java.</w:t>
       </w:r>
     </w:p>
     <w:p>
@@ -14527,7 +14527,7 @@
         <w:jc w:val="both"/>
       </w:pPr>
       <w:r>
-        <w:t>A automação de API (pasta API) valida a US-0003 com Supertest, Mocha e Chai. Os padrões adotados foram Service Object (support/api.js centraliza os endpoints e a autenticação Basic) e Data Factory (support/factory.js gera códigos de cupom únicos com Faker, evitando conflito com execuções anteriores). Os contratos são validados com Joi (contracts/cupom.contract.js) para a resposta de cupom, para a lista de cupons e para o formato de erro. Os cupons criados durante os testes são excluídos ao final (DELETE ?force=true), mantendo o ambiente limpo.</w:t>
+        <w:t>Os testes da API (pasta API) validam a US-0003 usando Supertest, Mocha e Chai. Separei as chamadas da API em um arquivo próprio (support/api.js), que já cuida da autenticação, e criei uma função que gera cupons com código aleatório usando o Faker (support/factory.js), para não dar conflito com cupons criados antes. Os contratos são validados com Joi (contracts/cupom.contract.js) e no final os cupons criados nos testes são apagados.</w:t>
       </w:r>
     </w:p>
     <w:p>
@@ -14537,7 +14537,7 @@
         <w:jc w:val="both"/>
       </w:pPr>
       <w:r>
-        <w:t>Foram automatizados 8 casos: listagem e busca por ID (200 + contrato), ID inexistente (404), acesso sem autenticação (401), cadastro com campos obrigatórios (201 + contrato), código repetido, ausência de code e discount_type inválido (400). O relatório é gerado com o Mochawesome.</w:t>
+        <w:t>São 8 casos: listar cupons e buscar por ID (status 200 e contrato), ID que não existe (404), sem autenticação (401), cadastrar cupom (201 e contrato), código repetido, sem código e tipo de desconto inválido (400). O relatório é gerado com o Mochawesome.</w:t>
       </w:r>
     </w:p>
     <w:p>
@@ -14606,7 +14606,7 @@
         <w:jc w:val="both"/>
       </w:pPr>
       <w:r>
-        <w:t>A automação mobile (pasta Mobile) considera apenas a funcionalidade de Catálogo de Produtos, conforme o enunciado. Foi escolhida a plataforma iOS, pois o aplicativo iOS disponibilizado pela EBAC (EBAC Store) é o aplicativo de catálogo voltado ao cliente, enquanto o APK Android corresponde ao aplicativo administrativo do WooCommerce. Os testes usam WebdriverIO 9 com Appium (XCUITest) executando em simuladores iOS do Sauce Labs, o que dispensa Mac e emuladores locais e permite a execução pelo GitHub Actions (workflow mobile.yml, acionado manualmente). Foi aplicado o padrão Screen Object (home.screen.js e browse.screen.js, equivalentes ao Page Object para telas mobile), e o relatório é gerado com o Allure, complementado pelo vídeo e pelos logs de cada sessão no Sauce Labs.</w:t>
+        <w:t>Nos testes do aplicativo (pasta Mobile) considerei só o Catálogo de Produtos, como pede o enunciado. Escolhi o iOS porque o app de iOS da EBAC é o catálogo para o cliente, enquanto o APK de Android é o app de administração do WooCommerce. Usei WebdriverIO com Appium rodando em um simulador de iPhone no Sauce Labs, porque não tenho Mac. Organizei o código com Screen Objects (home.screen.js e browse.screen.js), que é o Page Object para telas de app, e o relatório é gerado com o Allure. O Sauce Labs também grava vídeo e log de cada execução.</w:t>
       </w:r>
     </w:p>
     <w:p>
@@ -14616,7 +14616,7 @@
         <w:jc w:val="both"/>
       </w:pPr>
       <w:r>
-        <w:t>Foram automatizados três casos: CT-MOB-02 (listagem de produtos com nome e preço na aba Browse), CT-MOB-03 (busca por produto existente) e CT-MOB-04 (busca sem resultado). O CT-MOB-04 – caminho alternativo – foi aprovado: o aplicativo exibiu a mensagem "No products found" e nenhum preço foi listado (Figura abaixo). Os casos de caminho feliz CT-MOB-02 e CT-MOB-03 estão implementados, mas não concluíram dentro do tempo limite nas execuções em nuvem: a própria busca funciona (a lista é filtrada corretamente, como mostram os vídeos das sessões), porém as consultas de elementos do Appium excedem o tempo limite e o Sauce Labs encerra a sessão.</w:t>
+        <w:t>Automatizei três casos: CT-MOB-02 (lista de produtos com nome e preço), CT-MOB-03 (busca de produto que existe) e CT-MOB-04 (busca sem resultado). O CT-MOB-04, que é o caminho alternativo, passou: o app mostrou a mensagem "No products found" e nenhum produto apareceu. Os casos CT-MOB-02 e CT-MOB-03 estão prontos, mas não terminaram dentro do tempo no Sauce Labs. A busca em si funciona (dá para ver nos vídeos que a lista é filtrada), porém o Appium demora demais para encontrar os elementos na tela e o Sauce acaba encerrando a sessão.</w:t>
       </w:r>
     </w:p>
     <w:p>
@@ -14626,7 +14626,7 @@
         <w:jc w:val="both"/>
       </w:pPr>
       <w:r>
-        <w:t>A análise das execuções mostrou que a causa é a árvore de acessibilidade do aplicativo, construído em React Native: os cards agrupam nome e preço em um único elemento e as telas possuem centenas de nós, o que torna lenta cada captura (snapshot) do XCUITest. Também foi identificado que as animações contínuas do app faziam cada comando aguardar 60 segundos, problema contornado com as configurações reduceMotion e waitForIdleTimeout = 0. Como melhorias, recomenda-se ao time de desenvolvimento adicionar identificadores de acessibilidade (testID / accessibilityIdentifier) aos cards e ao campo de busca e simplificar a hierarquia de componentes, o que tornaria os testes mais rápidos e estáveis. O caso CT-MOB-01 (vitrine da Home) foi mantido como teste manual pelo mesmo motivo, já que a Home é a tela com a maior árvore de elementos.</w:t>
+        <w:t>Investigando, vi que o problema está na forma como o app foi feito (React Native): cada card junta nome e preço em um único elemento e as telas têm centenas de elementos, o que deixa o Appium muito lento para ler a tela. No começo cada comando também demorava 60 segundos por causa das animações do app, o que resolvi com as configurações reduceMotion e waitForIdleTimeout. Como sugestão para o time de desenvolvimento, colocar identificadores (testID) nos cards e no campo de busca deixaria os testes bem mais rápidos e estáveis. O caso CT-MOB-01 (tela inicial) ficou manual pelo mesmo motivo, porque a Home é a tela mais pesada do app.</w:t>
       </w:r>
     </w:p>
     <w:p>
@@ -14746,7 +14746,7 @@
         <w:jc w:val="both"/>
       </w:pPr>
       <w:r>
-        <w:t>A integração contínua foi implementada com GitHub Actions. A cada push ou pull request na branch main, o workflow ci.yml executa em paralelo os testes de API e UI e, em seguida, os testes de performance (a carga de 20 usuários degradava o servidor compartilhado e derrubava os testes funcionais quando executados juntos); os relatórios são publicados como artefatos e, ao final, reunidos e publicados no GitHub Pages. O workflow mobile.yml executa os testes do aplicativo no Sauce Labs, com as credenciais armazenadas em GitHub Secrets.</w:t>
+        <w:t>A integração contínua foi feita com GitHub Actions. A cada push na branch main o workflow ci.yml roda os testes de API e UI ao mesmo tempo e depois os testes de performance. No começo eu rodava tudo junto, mas a carga do k6 deixava o servidor da loja lento e os testes de API e UI falhavam, então coloquei o k6 para rodar depois. No final os relatórios são publicados no GitHub Pages. O workflow mobile.yml roda os testes do app no Sauce Labs, com as credenciais guardadas nos Secrets do GitHub.</w:t>
       </w:r>
     </w:p>
     <w:p>
@@ -14766,7 +14766,7 @@
         <w:t xml:space="preserve">api: </w:t>
       </w:r>
       <w:r>
-        <w:t>Node 20, npm ci e npm test (Supertest), relatório Mochawesome como artefato.</w:t>
+        <w:t>instala as dependências, roda os testes com Supertest e salva o relatório.</w:t>
       </w:r>
     </w:p>
     <w:p>
@@ -14786,7 +14786,7 @@
         <w:t xml:space="preserve">ui: </w:t>
       </w:r>
       <w:r>
-        <w:t>cypress-io/github-action no Chrome headless, relatório Mochawesome como artefato.</w:t>
+        <w:t>roda o Cypress no Chrome e salva o relatório.</w:t>
       </w:r>
     </w:p>
     <w:p>
@@ -14806,7 +14806,7 @@
         <w:t xml:space="preserve">performance: </w:t>
       </w:r>
       <w:r>
-        <w:t>grafana/setup-k6-action executa login.test.js e catalogo.test.js; marcado como continue-on-error, pois o ambiente é compartilhado e os thresholds estourados são achados documentados, e não falhas funcionais.</w:t>
+        <w:t>roda os dois testes do k6. Coloquei continue-on-error porque o ambiente é compartilhado e os limites estourados são um problema encontrado, não um erro dos testes.</w:t>
       </w:r>
     </w:p>
     <w:p>
@@ -14826,7 +14826,7 @@
         <w:t xml:space="preserve">relatorios: </w:t>
       </w:r>
       <w:r>
-        <w:t>baixa os artefatos e publica um índice com todos os relatórios no GitHub Pages.</w:t>
+        <w:t>junta os relatórios e publica no GitHub Pages.</w:t>
       </w:r>
     </w:p>
     <w:p>
@@ -14846,7 +14846,7 @@
         <w:t xml:space="preserve">mobile.yml: </w:t>
       </w:r>
       <w:r>
-        <w:t>WebdriverIO no Sauce Labs com SAUCE_USERNAME, SAUCE_ACCESS_KEY e SAUCE_APP em Secrets e relatório Allure como artefato; acionado manualmente (workflow_dispatch), pois a conta Sauce é trial e as sessões do app iOS são longas.</w:t>
+        <w:t>roda os testes do app no Sauce Labs. Deixei para rodar manualmente porque minha conta do Sauce é de teste (trial) e cada execução demora bastante.</w:t>
       </w:r>
     </w:p>
     <w:p>
@@ -14897,7 +14897,7 @@
           <w:i/>
           <w:sz w:val="18"/>
         </w:rPr>
-        <w:t>Figura 6 – Pipeline no GitHub Actions: API e UI aprovados, relatórios publicados no GitHub Pages; o job de k6 sinaliza os thresholds estourados (BUG-05) sem bloquear o pipeline.</w:t>
+        <w:t>Figura 6 – Execução no GitHub Actions: API e UI passaram e os relatórios foram publicados. O k6 ficou vermelho por causa dos limites estourados (BUG-05).</w:t>
       </w:r>
     </w:p>
     <w:p>
@@ -14915,7 +14915,7 @@
         <w:jc w:val="both"/>
       </w:pPr>
       <w:r>
-        <w:t>Os testes de performance foram implementados com k6 para dois casos: CT-PERF-01 – login na plataforma (abre Minha Conta, extrai o nonce do formulário e autentica) e CT-PERF-02 – navegação no catálogo (listagem, busca e detalhe do produto). A configuração segue o enunciado: 20 usuários virtuais, 2 minutos de execução e ramp-up de 20 segundos (stages: 20 s subindo até 20 VUs, 1 min 30 s sustentando e 10 s de ramp-down). A massa de dados user1_ebac a user5_ebac é carregada com SharedArray e distribuída entre os VUs. Foram definidos os thresholds: p95 de http_req_duration &lt; 3 s, taxa de falhas &lt; 5% e checks &gt; 95%.</w:t>
+        <w:t>Fiz os testes de performance com k6 em dois casos: CT-PERF-01, o login (abre a página Minha Conta, pega o nonce do formulário e faz o login), e CT-PERF-02, a navegação no catálogo (lista de produtos, busca e página do produto). Usei a configuração pedida: 20 usuários virtuais, 2 minutos de teste e 20 segundos de ramp-up. Os usuários user1_ebac a user5_ebac são carregados com SharedArray e divididos entre os usuários virtuais. Defini como limites: p95 do tempo de resposta menor que 3 segundos, menos de 5% de erros e mais de 95% dos checks OK.</w:t>
       </w:r>
     </w:p>
     <w:p>
@@ -15471,7 +15471,7 @@
         <w:jc w:val="both"/>
       </w:pPr>
       <w:r>
-        <w:t>Os resultados mostram que o ambiente não sustenta 20 usuários simultâneos dentro do objetivo de tempo de resposta: o p95 ficou bem acima de 3 segundos nos dois cenários e o tempo médio de resposta ultrapassou 3 segundos. No login, parte das requisições retornou 502 Bad Gateway e, em alguns momentos, a página Minha Conta foi entregue incompleta (sem o formulário), o que derrubou a taxa de checks. No catálogo, a taxa de falhas HTTP ficou dentro do limite, mas a latência também degradou com o aumento de usuários.</w:t>
+        <w:t>Os resultados mostram que a loja não aguenta bem 20 usuários ao mesmo tempo. O p95 ficou bem acima de 3 segundos nos dois testes e a média passou de 3 segundos. No login algumas requisições voltaram com erro 502 (Bad Gateway) e em alguns momentos a página Minha Conta veio incompleta, sem o formulário, por isso a taxa de checks caiu. No catálogo quase não teve erro, mas o tempo de resposta também piorou com mais usuários.</w:t>
       </w:r>
     </w:p>
     <w:p>
@@ -15481,7 +15481,7 @@
         <w:jc w:val="both"/>
       </w:pPr>
       <w:r>
-        <w:t>Como o ambiente é compartilhado por todos os alunos, recomenda-se repetir os testes no ambiente Docker isolado para separar o efeito do ambiente do desempenho da aplicação; ainda assim, o resultado foi registrado como defeito (BUG-05) e indica a necessidade de cache de páginas, ajuste do servidor (PHP-FPM/nginx) e monitoramento.</w:t>
+        <w:t>Como a loja online é usada por todos os alunos ao mesmo tempo, o ideal seria repetir o teste na loja do Docker para ver o quanto é culpa do ambiente. Mesmo assim registrei o problema como bug (BUG-05) e a sugestão seria usar cache nas páginas e ajustar o servidor.</w:t>
       </w:r>
     </w:p>
     <w:p>
@@ -15606,7 +15606,7 @@
         <w:jc w:val="both"/>
       </w:pPr>
       <w:r>
-        <w:t>Realizar este trabalho foi bastante desafiador e, ao mesmo tempo, a melhor forma de consolidar tudo o que vi na formação. Precisei juntar em um único projeto assuntos que estudei separadamente ao longo dos módulos: escrever histórias e critérios em Gherkin, aplicar técnicas como partição de equivalência, valor limite e tabela de decisão, automatizar testes de UI com Cypress, de API com Supertest e contratos, de aplicativos com Appium e WebdriverIO, rodar testes de carga com k6 e colocar tudo isso para rodar sozinho no GitHub Actions.</w:t>
+        <w:t>Fazer este trabalho foi bem desafiador, mas foi a melhor forma de juntar tudo o que vi no curso. Precisei usar em um só projeto coisas que estudei separadas: escrever histórias e critérios em Gherkin, aplicar partição de equivalência, valor limite e tabela de decisão, automatizar testes web com Cypress, testes de API com Supertest, testes de app com Appium e WebdriverIO, fazer teste de carga com k6 e colocar tudo para rodar no GitHub Actions.</w:t>
       </w:r>
     </w:p>
     <w:p>
@@ -15616,7 +15616,7 @@
         <w:jc w:val="both"/>
       </w:pPr>
       <w:r>
-        <w:t>Alguns módulos foram bem difíceis para mim. A parte de mobile foi a que mais exigiu paciência: configurar Appium, emuladores e depois o Sauce Labs, entender os seletores de cada plataforma e lidar com sessões lentas e instáveis. Integração contínua e performance também tiveram uma curva grande, principalmente para entender por que algo funcionava na minha máquina e falhava no pipeline, ou para interpretar métricas como p95 e taxa de falhas em vez de simplesmente olhar se o teste "passou". Mesmo assim, foi justamente nesses pontos que mais aprendi.</w:t>
+        <w:t>Alguns módulos foram bem difíceis para mim. A parte de mobile foi a que mais deu trabalho: configurar o Appium, o Sauce Labs, achar os elementos na tela e lidar com testes lentos e instáveis. Integração contínua e performance também me custaram, principalmente para entender por que algo funcionava na minha máquina e falhava no pipeline, e para entender métricas como p95 em vez de só olhar se o teste passou. Foi justamente nessas partes que eu mais aprendi.</w:t>
       </w:r>
     </w:p>
     <w:p>
@@ -15626,7 +15626,7 @@
         <w:jc w:val="both"/>
       </w:pPr>
       <w:r>
-        <w:t>A principal lição que levo para a vida profissional é que qualidade começa antes do código: critérios bem escritos e uma estratégia clara evitam retrabalho e mostram onde vale a pena automatizar. Também ficou claro que automação não substitui a análise do QE – foram os testes manuais e exploratórios das regras de negócio que revelaram defeitos importantes, como o carrinho sem limite de itens e o login sem bloqueio. Termino a formação com muito mais maturidade na área, segurança para propor estratégias de teste e um portfólio real no GitHub que demonstra o fluxo completo de trabalho de um Engenheiro de Qualidade.</w:t>
+        <w:t>A principal lição que levo é que a qualidade começa antes do código: critérios bem escritos e uma estratégia clara evitam retrabalho e ajudam a decidir o que vale automatizar. Também vi que a automação não substitui a análise do QE, já que foram os testes manuais das regras de negócio que mostraram bugs importantes, como o carrinho sem limite de itens e o login sem bloqueio. Termino o curso me sentindo muito mais preparado para a área e com um projeto no GitHub que mostra o trabalho completo de um QE.</w:t>
       </w:r>
     </w:p>
     <w:p>

</xml_diff>